<commit_message>
docs(worker-isolation): concise responsibility/resource table; profile BM25 re-tokenisation + evidence-validation loops (evidence only, no scoring change); record verified test re-run
- RESPONSIBILITY_TABLE.md: single pre-implementation contract (claim owner, context
  propagation, authoritative transitions, cancellation, child/descendant termination,
  retries, aggregate DB/browser/LLM budgets) grounded in code file:line refs.
- PROFILE_EVIDENCE.md §7: quantified BM25 re-tokenisation (bm25Score re-tokenises cached
  index.documents; tokenize 7411ms total vs 2053ms single index pass) and per-measure
  evidence-validation loop amplifier; marked out-of-scope follow-up, no rule change bundled.
- TEST_RESULTS.md: verified re-run 9/9 pass, full-pipeline parent max lag 12.2ms.
</commit_message>
<xml_diff>
--- a/docs/worker-isolation/PROFILE_EVIDENCE.docx
+++ b/docs/worker-isolation/PROFILE_EVIDENCE.docx
@@ -2,7 +2,7 @@
 <file path=word/document.xml><?xml version="1.0" encoding="utf-8"?>
 <w:document xmlns:w="http://schemas.openxmlformats.org/wordprocessingml/2006/main" xmlns:m="http://schemas.openxmlformats.org/officeDocument/2006/math" xmlns:r="http://schemas.openxmlformats.org/officeDocument/2006/relationships" xmlns:o="urn:schemas-microsoft-com:office:office" xmlns:v="urn:schemas-microsoft-com:vml" xmlns:w10="urn:schemas-microsoft-com:office:word" xmlns:a="http://schemas.openxmlformats.org/drawingml/2006/main" xmlns:pic="http://schemas.openxmlformats.org/drawingml/2006/picture" xmlns:wp="http://schemas.openxmlformats.org/drawingml/2006/wordprocessingDrawing">
   <w:body>
-    <w:bookmarkStart w:id="31" w:name="Xb82fcf02904b4fb359837d5fc6a41fab8629057"/>
+    <w:bookmarkStart w:id="35" w:name="Xb82fcf02904b4fb359837d5fc6a41fab8629057"/>
     <w:p>
       <w:pPr>
         <w:pStyle w:val="Heading1"/>
@@ -5438,7 +5438,898 @@
       </w:r>
     </w:p>
     <w:bookmarkEnd w:id="30"/>
+    <w:bookmarkStart w:id="34" w:name="X8d1cc6380b6463d62f15dd4c3ac23b830b75718"/>
+    <w:p>
+      <w:pPr>
+        <w:pStyle w:val="Heading2"/>
+      </w:pPr>
+      <w:r>
+        <w:t xml:space="preserve">7. Observed BM25 re-tokenisation and the evidence-validation loop (requested characterisation)</w:t>
+      </w:r>
+    </w:p>
+    <w:p>
+      <w:pPr>
+        <w:pStyle w:val="FirstParagraph"/>
+      </w:pPr>
+      <w:r>
+        <w:t xml:space="preserve">This section characterises the two loops called out in review. It is</w:t>
+      </w:r>
+      <w:r>
+        <w:t xml:space="preserve"> </w:t>
+      </w:r>
+      <w:r>
+        <w:rPr>
+          <w:bCs/>
+          <w:b/>
+        </w:rPr>
+        <w:t xml:space="preserve">evidence only</w:t>
+      </w:r>
+      <w:r>
+        <w:t xml:space="preserve">: no scoring-rule or BM25 change is made on this branch — the isolation fix moves the whole pipeline off the main loop and preserves scoring byte-for-byte. Optimising these loops is a separate, out-of-scope follow-up.</w:t>
+      </w:r>
+    </w:p>
+    <w:p>
+      <w:pPr>
+        <w:pStyle w:val="BodyText"/>
+      </w:pPr>
+      <w:r>
+        <w:rPr>
+          <w:bCs/>
+          <w:b/>
+        </w:rPr>
+        <w:t xml:space="preserve">Figures are from the 4-concurrent capture</w:t>
+      </w:r>
+      <w:r>
+        <w:t xml:space="preserve"> </w:t>
+      </w:r>
+      <w:r>
+        <w:t xml:space="preserve">(</w:t>
+      </w:r>
+      <w:r>
+        <w:rPr>
+          <w:rStyle w:val="VerbatimChar"/>
+        </w:rPr>
+        <w:t xml:space="preserve">evidence/cpuprofile-analysis-c4.json</w:t>
+      </w:r>
+      <w:r>
+        <w:t xml:space="preserve">):</w:t>
+      </w:r>
+      <w:r>
+        <w:t xml:space="preserve"> </w:t>
+      </w:r>
+      <w:r>
+        <w:rPr>
+          <w:rStyle w:val="VerbatimChar"/>
+        </w:rPr>
+        <w:t xml:space="preserve">totalProfiledMs</w:t>
+      </w:r>
+      <w:r>
+        <w:t xml:space="preserve"> </w:t>
+      </w:r>
+      <w:r>
+        <w:t xml:space="preserve">74,530;</w:t>
+      </w:r>
+      <w:r>
+        <w:t xml:space="preserve"> </w:t>
+      </w:r>
+      <w:r>
+        <w:rPr>
+          <w:rStyle w:val="VerbatimChar"/>
+        </w:rPr>
+        <w:t xml:space="preserve">busyMs</w:t>
+      </w:r>
+      <w:r>
+        <w:t xml:space="preserve"> </w:t>
+      </w:r>
+      <w:r>
+        <w:t xml:space="preserve">46,936 (</w:t>
+      </w:r>
+      <w:r>
+        <w:rPr>
+          <w:bCs/>
+          <w:b/>
+        </w:rPr>
+        <w:t xml:space="preserve">63 %</w:t>
+      </w:r>
+      <w:r>
+        <w:t xml:space="preserve">);</w:t>
+      </w:r>
+      <w:r>
+        <w:t xml:space="preserve"> </w:t>
+      </w:r>
+      <w:r>
+        <w:rPr>
+          <w:rStyle w:val="VerbatimChar"/>
+        </w:rPr>
+        <w:t xml:space="preserve">blockingMs</w:t>
+      </w:r>
+      <w:r>
+        <w:t xml:space="preserve"> </w:t>
+      </w:r>
+      <w:r>
+        <w:t xml:space="preserve">45,524. Entry frames</w:t>
+      </w:r>
+      <w:r>
+        <w:t xml:space="preserve"> </w:t>
+      </w:r>
+      <w:r>
+        <w:rPr>
+          <w:rStyle w:val="VerbatimChar"/>
+        </w:rPr>
+        <w:t xml:space="preserve">analyzeCompanyMeasures</w:t>
+      </w:r>
+      <w:r>
+        <w:t xml:space="preserve"> </w:t>
+      </w:r>
+      <w:r>
+        <w:t xml:space="preserve">19,184 ms and</w:t>
+      </w:r>
+      <w:r>
+        <w:t xml:space="preserve"> </w:t>
+      </w:r>
+      <w:r>
+        <w:rPr>
+          <w:rStyle w:val="VerbatimChar"/>
+        </w:rPr>
+        <w:t xml:space="preserve">summarizeDocuments</w:t>
+      </w:r>
+      <w:r>
+        <w:t xml:space="preserve"> </w:t>
+      </w:r>
+      <w:r>
+        <w:t xml:space="preserve">14,892 ms dominate — i.e. the per-measure analysis path, not fetch/LLM.</w:t>
+      </w:r>
+    </w:p>
+    <w:bookmarkStart w:id="31" w:name="X32e3cfff1f54bb0c93756427bf15eba4aa5fd28"/>
+    <w:p>
+      <w:pPr>
+        <w:pStyle w:val="Heading3"/>
+      </w:pPr>
+      <w:r>
+        <w:t xml:space="preserve">7.1 BM25 re-tokenisation (redundant work, not a correctness bug)</w:t>
+      </w:r>
+    </w:p>
+    <w:p>
+      <w:pPr>
+        <w:pStyle w:val="FirstParagraph"/>
+      </w:pPr>
+      <w:r>
+        <w:rPr>
+          <w:rStyle w:val="VerbatimChar"/>
+        </w:rPr>
+        <w:t xml:space="preserve">buildBM25Index(chunks)</w:t>
+      </w:r>
+      <w:r>
+        <w:t xml:space="preserve"> </w:t>
+      </w:r>
+      <w:r>
+        <w:t xml:space="preserve">(</w:t>
+      </w:r>
+      <w:r>
+        <w:rPr>
+          <w:rStyle w:val="VerbatimChar"/>
+        </w:rPr>
+        <w:t xml:space="preserve">passage-retrieval.ts:342</w:t>
+      </w:r>
+      <w:r>
+        <w:t xml:space="preserve">) tokenises</w:t>
+      </w:r>
+      <w:r>
+        <w:t xml:space="preserve"> </w:t>
+      </w:r>
+      <w:r>
+        <w:rPr>
+          <w:bCs/>
+          <w:b/>
+        </w:rPr>
+        <w:t xml:space="preserve">every chunk once</w:t>
+      </w:r>
+      <w:r>
+        <w:t xml:space="preserve"> </w:t>
+      </w:r>
+      <w:r>
+        <w:t xml:space="preserve">to populate</w:t>
+      </w:r>
+      <w:r>
+        <w:t xml:space="preserve"> </w:t>
+      </w:r>
+      <w:r>
+        <w:rPr>
+          <w:rStyle w:val="VerbatimChar"/>
+        </w:rPr>
+        <w:t xml:space="preserve">docFreqs</w:t>
+      </w:r>
+      <w:r>
+        <w:t xml:space="preserve">/</w:t>
+      </w:r>
+      <w:r>
+        <w:rPr>
+          <w:rStyle w:val="VerbatimChar"/>
+        </w:rPr>
+        <w:t xml:space="preserve">docLengths</w:t>
+      </w:r>
+      <w:r>
+        <w:t xml:space="preserve">, then stores the index as</w:t>
+      </w:r>
+      <w:r>
+        <w:t xml:space="preserve"> </w:t>
+      </w:r>
+      <w:r>
+        <w:rPr>
+          <w:rStyle w:val="VerbatimChar"/>
+        </w:rPr>
+        <w:t xml:space="preserve">{ documents: chunks, docFreqs, docLengths, … }</w:t>
+      </w:r>
+      <w:r>
+        <w:t xml:space="preserve"> </w:t>
+      </w:r>
+      <w:r>
+        <w:t xml:space="preserve">— it keeps the</w:t>
+      </w:r>
+      <w:r>
+        <w:t xml:space="preserve"> </w:t>
+      </w:r>
+      <w:r>
+        <w:rPr>
+          <w:bCs/>
+          <w:b/>
+        </w:rPr>
+        <w:t xml:space="preserve">raw chunk strings</w:t>
+      </w:r>
+      <w:r>
+        <w:t xml:space="preserve">, not the token arrays.</w:t>
+      </w:r>
+      <w:r>
+        <w:t xml:space="preserve"> </w:t>
+      </w:r>
+      <w:r>
+        <w:rPr>
+          <w:rStyle w:val="VerbatimChar"/>
+        </w:rPr>
+        <w:t xml:space="preserve">bm25Score(query, docIndex, index)</w:t>
+      </w:r>
+      <w:r>
+        <w:t xml:space="preserve"> </w:t>
+      </w:r>
+      <w:r>
+        <w:t xml:space="preserve">(</w:t>
+      </w:r>
+      <w:r>
+        <w:rPr>
+          <w:rStyle w:val="VerbatimChar"/>
+        </w:rPr>
+        <w:t xml:space="preserve">passage-retrieval.ts:377</w:t>
+      </w:r>
+      <w:r>
+        <w:t xml:space="preserve">) therefore re-runs</w:t>
+      </w:r>
+      <w:r>
+        <w:t xml:space="preserve"> </w:t>
+      </w:r>
+      <w:r>
+        <w:rPr>
+          <w:rStyle w:val="VerbatimChar"/>
+        </w:rPr>
+        <w:t xml:space="preserve">const docTokens = tokenize(index.documents[docIndex])</w:t>
+      </w:r>
+      <w:r>
+        <w:t xml:space="preserve"> </w:t>
+      </w:r>
+      <w:r>
+        <w:rPr>
+          <w:bCs/>
+          <w:b/>
+        </w:rPr>
+        <w:t xml:space="preserve">on every scoring call</w:t>
+      </w:r>
+      <w:r>
+        <w:t xml:space="preserve">. Each chunk is thus tokenised once at index build and</w:t>
+      </w:r>
+      <w:r>
+        <w:t xml:space="preserve"> </w:t>
+      </w:r>
+      <w:r>
+        <w:rPr>
+          <w:bCs/>
+          <w:b/>
+        </w:rPr>
+        <w:t xml:space="preserve">again every time it is scored</w:t>
+      </w:r>
+      <w:r>
+        <w:t xml:space="preserve">.</w:t>
+      </w:r>
+    </w:p>
+    <w:p>
+      <w:pPr>
+        <w:pStyle w:val="BodyText"/>
+      </w:pPr>
+      <w:r>
+        <w:t xml:space="preserve">Profile support (self-time, c4):</w:t>
+      </w:r>
+    </w:p>
+    <w:tbl>
+      <w:tblPr>
+        <w:tblStyle w:val="Table"/>
+        <w:tblW w:type="pct" w:w="5000"/>
+        <w:tblLook w:firstRow="1" w:lastRow="0" w:firstColumn="0" w:lastColumn="0" w:noHBand="0" w:noVBand="0" w:val="0020"/>
+        <w:jc w:val="start"/>
+      </w:tblPr>
+      <w:tblGrid>
+        <w:gridCol w:w="2640"/>
+        <w:gridCol w:w="2640"/>
+        <w:gridCol w:w="2640"/>
+      </w:tblGrid>
+      <w:tr>
+        <w:trPr>
+          <w:tblHeader w:val="true"/>
+        </w:trPr>
+        <w:tc>
+          <w:tcPr/>
+          <w:p>
+            <w:pPr>
+              <w:pStyle w:val="Compact"/>
+              <w:jc w:val="left"/>
+            </w:pPr>
+            <w:r>
+              <w:t xml:space="preserve">Frame</w:t>
+            </w:r>
+          </w:p>
+        </w:tc>
+        <w:tc>
+          <w:tcPr/>
+          <w:p>
+            <w:pPr>
+              <w:pStyle w:val="Compact"/>
+              <w:jc w:val="left"/>
+            </w:pPr>
+            <w:r>
+              <w:t xml:space="preserve">ms</w:t>
+            </w:r>
+          </w:p>
+        </w:tc>
+        <w:tc>
+          <w:tcPr/>
+          <w:p>
+            <w:pPr>
+              <w:pStyle w:val="Compact"/>
+              <w:jc w:val="left"/>
+            </w:pPr>
+            <w:r>
+              <w:t xml:space="preserve">note</w:t>
+            </w:r>
+          </w:p>
+        </w:tc>
+      </w:tr>
+      <w:tr>
+        <w:tc>
+          <w:tcPr/>
+          <w:p>
+            <w:pPr>
+              <w:pStyle w:val="Compact"/>
+              <w:jc w:val="left"/>
+            </w:pPr>
+            <w:r>
+              <w:rPr>
+                <w:rStyle w:val="VerbatimChar"/>
+              </w:rPr>
+              <w:t xml:space="preserve">tokenize</w:t>
+            </w:r>
+            <w:r>
+              <w:t xml:space="preserve"> </w:t>
+            </w:r>
+            <w:r>
+              <w:t xml:space="preserve">(total / leaf)</w:t>
+            </w:r>
+          </w:p>
+        </w:tc>
+        <w:tc>
+          <w:tcPr/>
+          <w:p>
+            <w:pPr>
+              <w:pStyle w:val="Compact"/>
+              <w:jc w:val="left"/>
+            </w:pPr>
+            <w:r>
+              <w:rPr>
+                <w:bCs/>
+                <w:b/>
+              </w:rPr>
+              <w:t xml:space="preserve">7,411 / 4,525</w:t>
+            </w:r>
+          </w:p>
+        </w:tc>
+        <w:tc>
+          <w:tcPr/>
+          <w:p>
+            <w:pPr>
+              <w:pStyle w:val="Compact"/>
+              <w:jc w:val="left"/>
+            </w:pPr>
+            <w:r>
+              <w:t xml:space="preserve">top app function; 16.3 % of blocking</w:t>
+            </w:r>
+          </w:p>
+        </w:tc>
+      </w:tr>
+      <w:tr>
+        <w:tc>
+          <w:tcPr/>
+          <w:p>
+            <w:pPr>
+              <w:pStyle w:val="Compact"/>
+              <w:jc w:val="left"/>
+            </w:pPr>
+            <w:r>
+              <w:rPr>
+                <w:rStyle w:val="VerbatimChar"/>
+              </w:rPr>
+              <w:t xml:space="preserve">RegExp: \s+</w:t>
+            </w:r>
+            <w:r>
+              <w:t xml:space="preserve"> </w:t>
+            </w:r>
+            <w:r>
+              <w:t xml:space="preserve">(native, inside</w:t>
+            </w:r>
+            <w:r>
+              <w:t xml:space="preserve"> </w:t>
+            </w:r>
+            <w:r>
+              <w:rPr>
+                <w:rStyle w:val="VerbatimChar"/>
+              </w:rPr>
+              <w:t xml:space="preserve">tokenize</w:t>
+            </w:r>
+            <w:r>
+              <w:t xml:space="preserve">)</w:t>
+            </w:r>
+          </w:p>
+        </w:tc>
+        <w:tc>
+          <w:tcPr/>
+          <w:p>
+            <w:pPr>
+              <w:pStyle w:val="Compact"/>
+              <w:jc w:val="left"/>
+            </w:pPr>
+            <w:r>
+              <w:t xml:space="preserve">2,679</w:t>
+            </w:r>
+          </w:p>
+        </w:tc>
+        <w:tc>
+          <w:tcPr/>
+          <w:p>
+            <w:pPr>
+              <w:pStyle w:val="Compact"/>
+              <w:jc w:val="left"/>
+            </w:pPr>
+            <w:r>
+              <w:t xml:space="preserve">the split that</w:t>
+            </w:r>
+            <w:r>
+              <w:t xml:space="preserve"> </w:t>
+            </w:r>
+            <w:r>
+              <w:rPr>
+                <w:rStyle w:val="VerbatimChar"/>
+              </w:rPr>
+              <w:t xml:space="preserve">tokenize</w:t>
+            </w:r>
+            <w:r>
+              <w:t xml:space="preserve"> </w:t>
+            </w:r>
+            <w:r>
+              <w:t xml:space="preserve">re-runs per re-tokenisation</w:t>
+            </w:r>
+          </w:p>
+        </w:tc>
+      </w:tr>
+      <w:tr>
+        <w:tc>
+          <w:tcPr/>
+          <w:p>
+            <w:pPr>
+              <w:pStyle w:val="Compact"/>
+              <w:jc w:val="left"/>
+            </w:pPr>
+            <w:r>
+              <w:rPr>
+                <w:rStyle w:val="VerbatimChar"/>
+              </w:rPr>
+              <w:t xml:space="preserve">bm25Score</w:t>
+            </w:r>
+          </w:p>
+        </w:tc>
+        <w:tc>
+          <w:tcPr/>
+          <w:p>
+            <w:pPr>
+              <w:pStyle w:val="Compact"/>
+              <w:jc w:val="left"/>
+            </w:pPr>
+            <w:r>
+              <w:t xml:space="preserve">2,287</w:t>
+            </w:r>
+          </w:p>
+        </w:tc>
+        <w:tc>
+          <w:tcPr/>
+          <w:p>
+            <w:pPr>
+              <w:pStyle w:val="Compact"/>
+              <w:jc w:val="left"/>
+            </w:pPr>
+            <w:r>
+              <w:t xml:space="preserve">caller that re-tokenises</w:t>
+            </w:r>
+            <w:r>
+              <w:t xml:space="preserve"> </w:t>
+            </w:r>
+            <w:r>
+              <w:rPr>
+                <w:rStyle w:val="VerbatimChar"/>
+              </w:rPr>
+              <w:t xml:space="preserve">index.documents[docIndex]</w:t>
+            </w:r>
+          </w:p>
+        </w:tc>
+      </w:tr>
+      <w:tr>
+        <w:tc>
+          <w:tcPr/>
+          <w:p>
+            <w:pPr>
+              <w:pStyle w:val="Compact"/>
+              <w:jc w:val="left"/>
+            </w:pPr>
+            <w:r>
+              <w:rPr>
+                <w:rStyle w:val="VerbatimChar"/>
+              </w:rPr>
+              <w:t xml:space="preserve">buildBM25Index</w:t>
+            </w:r>
+          </w:p>
+        </w:tc>
+        <w:tc>
+          <w:tcPr/>
+          <w:p>
+            <w:pPr>
+              <w:pStyle w:val="Compact"/>
+              <w:jc w:val="left"/>
+            </w:pPr>
+            <w:r>
+              <w:t xml:space="preserve">2,053</w:t>
+            </w:r>
+          </w:p>
+        </w:tc>
+        <w:tc>
+          <w:tcPr/>
+          <w:p>
+            <w:pPr>
+              <w:pStyle w:val="Compact"/>
+              <w:jc w:val="left"/>
+            </w:pPr>
+            <w:r>
+              <w:t xml:space="preserve">the one</w:t>
+            </w:r>
+            <w:r>
+              <w:t xml:space="preserve"> </w:t>
+            </w:r>
+            <w:r>
+              <w:rPr>
+                <w:iCs/>
+                <w:i/>
+              </w:rPr>
+              <w:t xml:space="preserve">non-redundant</w:t>
+            </w:r>
+            <w:r>
+              <w:t xml:space="preserve"> </w:t>
+            </w:r>
+            <w:r>
+              <w:t xml:space="preserve">tokenise pass</w:t>
+            </w:r>
+          </w:p>
+        </w:tc>
+      </w:tr>
+    </w:tbl>
+    <w:p>
+      <w:pPr>
+        <w:pStyle w:val="BodyText"/>
+      </w:pPr>
+      <w:r>
+        <w:t xml:space="preserve">The gap between</w:t>
+      </w:r>
+      <w:r>
+        <w:t xml:space="preserve"> </w:t>
+      </w:r>
+      <w:r>
+        <w:rPr>
+          <w:rStyle w:val="VerbatimChar"/>
+        </w:rPr>
+        <w:t xml:space="preserve">buildBM25Index</w:t>
+      </w:r>
+      <w:r>
+        <w:t xml:space="preserve"> </w:t>
+      </w:r>
+      <w:r>
+        <w:t xml:space="preserve">(2,053 ms, one pass over all chunks) and total</w:t>
+      </w:r>
+      <w:r>
+        <w:t xml:space="preserve"> </w:t>
+      </w:r>
+      <w:r>
+        <w:rPr>
+          <w:rStyle w:val="VerbatimChar"/>
+        </w:rPr>
+        <w:t xml:space="preserve">tokenize</w:t>
+      </w:r>
+      <w:r>
+        <w:t xml:space="preserve"> </w:t>
+      </w:r>
+      <w:r>
+        <w:t xml:space="preserve">(7,411 ms) is the re-tokenisation tax: ~3.6× the work of a single pass, driven almost entirely by</w:t>
+      </w:r>
+      <w:r>
+        <w:t xml:space="preserve"> </w:t>
+      </w:r>
+      <w:r>
+        <w:rPr>
+          <w:rStyle w:val="VerbatimChar"/>
+        </w:rPr>
+        <w:t xml:space="preserve">bm25Score</w:t>
+      </w:r>
+      <w:r>
+        <w:t xml:space="preserve"> </w:t>
+      </w:r>
+      <w:r>
+        <w:t xml:space="preserve">re-walking cached documents. A per-index token cache (tokenising each chunk once, reused by</w:t>
+      </w:r>
+      <w:r>
+        <w:t xml:space="preserve"> </w:t>
+      </w:r>
+      <w:r>
+        <w:rPr>
+          <w:rStyle w:val="VerbatimChar"/>
+        </w:rPr>
+        <w:t xml:space="preserve">bm25Score</w:t>
+      </w:r>
+      <w:r>
+        <w:t xml:space="preserve">) would remove most of it — but that is a scoring-path change and is deliberately</w:t>
+      </w:r>
+      <w:r>
+        <w:t xml:space="preserve"> </w:t>
+      </w:r>
+      <w:r>
+        <w:rPr>
+          <w:bCs/>
+          <w:b/>
+        </w:rPr>
+        <w:t xml:space="preserve">not</w:t>
+      </w:r>
+      <w:r>
+        <w:t xml:space="preserve"> </w:t>
+      </w:r>
+      <w:r>
+        <w:t xml:space="preserve">in this branch.</w:t>
+      </w:r>
+    </w:p>
     <w:bookmarkEnd w:id="31"/>
+    <w:bookmarkStart w:id="32" w:name="evidence-validation-loop-amplifier"/>
+    <w:p>
+      <w:pPr>
+        <w:pStyle w:val="Heading3"/>
+      </w:pPr>
+      <w:r>
+        <w:t xml:space="preserve">7.2 Evidence-validation loop (amplifier)</w:t>
+      </w:r>
+    </w:p>
+    <w:p>
+      <w:pPr>
+        <w:pStyle w:val="FirstParagraph"/>
+      </w:pPr>
+      <w:r>
+        <w:t xml:space="preserve">Evidence packs are built per measure:</w:t>
+      </w:r>
+      <w:r>
+        <w:t xml:space="preserve"> </w:t>
+      </w:r>
+      <w:r>
+        <w:rPr>
+          <w:rStyle w:val="VerbatimChar"/>
+        </w:rPr>
+        <w:t xml:space="preserve">measures.map((measure) =&gt; buildEvidencePackForMeasure({ measure, chunks, bm25Index, … }))</w:t>
+      </w:r>
+      <w:r>
+        <w:t xml:space="preserve"> </w:t>
+      </w:r>
+      <w:r>
+        <w:t xml:space="preserve">(</w:t>
+      </w:r>
+      <w:r>
+        <w:rPr>
+          <w:rStyle w:val="VerbatimChar"/>
+        </w:rPr>
+        <w:t xml:space="preserve">passage-retrieval.ts:2352</w:t>
+      </w:r>
+      <w:r>
+        <w:t xml:space="preserve">), 36 iterations per company. Each iteration (a) re-tokenises the measure’s own keywords (</w:t>
+      </w:r>
+      <w:r>
+        <w:rPr>
+          <w:rStyle w:val="VerbatimChar"/>
+        </w:rPr>
+        <w:t xml:space="preserve">evidenceKeywordTokens.push(...tokenize(kw))</w:t>
+      </w:r>
+      <w:r>
+        <w:t xml:space="preserve">,</w:t>
+      </w:r>
+      <w:r>
+        <w:t xml:space="preserve"> </w:t>
+      </w:r>
+      <w:r>
+        <w:rPr>
+          <w:rStyle w:val="VerbatimChar"/>
+        </w:rPr>
+        <w:t xml:space="preserve">passage-retrieval.ts:1349</w:t>
+      </w:r>
+      <w:r>
+        <w:t xml:space="preserve">) and (b) scores candidate chunks through</w:t>
+      </w:r>
+      <w:r>
+        <w:t xml:space="preserve"> </w:t>
+      </w:r>
+      <w:r>
+        <w:rPr>
+          <w:rStyle w:val="VerbatimChar"/>
+        </w:rPr>
+        <w:t xml:space="preserve">bm25Score</w:t>
+      </w:r>
+      <w:r>
+        <w:t xml:space="preserve">, which re-tokenises those chunks again (7.1). The</w:t>
+      </w:r>
+      <w:r>
+        <w:t xml:space="preserve"> </w:t>
+      </w:r>
+      <w:r>
+        <w:rPr>
+          <w:bCs/>
+          <w:b/>
+        </w:rPr>
+        <w:t xml:space="preserve">same documents are re-tokenised across all 36 per-measure passes</w:t>
+      </w:r>
+      <w:r>
+        <w:t xml:space="preserve">, so §7.1’s per-call cost is multiplied by the measure fan-out. This is why</w:t>
+      </w:r>
+      <w:r>
+        <w:t xml:space="preserve"> </w:t>
+      </w:r>
+      <w:r>
+        <w:rPr>
+          <w:rStyle w:val="VerbatimChar"/>
+        </w:rPr>
+        <w:t xml:space="preserve">analyzeCompanyMeasures</w:t>
+      </w:r>
+      <w:r>
+        <w:t xml:space="preserve">/</w:t>
+      </w:r>
+      <w:r>
+        <w:rPr>
+          <w:rStyle w:val="VerbatimChar"/>
+        </w:rPr>
+        <w:t xml:space="preserve">summarizeDocuments</w:t>
+      </w:r>
+      <w:r>
+        <w:t xml:space="preserve"> </w:t>
+      </w:r>
+      <w:r>
+        <w:t xml:space="preserve">carry ~34 s of the 45.5 s blocking total: the loop structure amplifies a redundant per-document cost across 36 measures × many chunks.</w:t>
+      </w:r>
+    </w:p>
+    <w:bookmarkEnd w:id="32"/>
+    <w:bookmarkStart w:id="33" w:name="Xce1f98175e791e8a2f5ab27af3cf6635b16dde3"/>
+    <w:p>
+      <w:pPr>
+        <w:pStyle w:val="Heading3"/>
+      </w:pPr>
+      <w:r>
+        <w:t xml:space="preserve">7.3 Why this supports the isolation decision (not a scoring fix)</w:t>
+      </w:r>
+    </w:p>
+    <w:p>
+      <w:pPr>
+        <w:pStyle w:val="FirstParagraph"/>
+      </w:pPr>
+      <w:r>
+        <w:t xml:space="preserve">Even if re-tokenisation were cached away, ~half the blocking time remains — GC (6,964 ms),</w:t>
+      </w:r>
+      <w:r>
+        <w:t xml:space="preserve"> </w:t>
+      </w:r>
+      <w:r>
+        <w:rPr>
+          <w:rStyle w:val="VerbatimChar"/>
+        </w:rPr>
+        <w:t xml:space="preserve">corpus-boilerplate</w:t>
+      </w:r>
+      <w:r>
+        <w:t xml:space="preserve"> </w:t>
+      </w:r>
+      <w:r>
+        <w:t xml:space="preserve">(7,268 ms module total),</w:t>
+      </w:r>
+      <w:r>
+        <w:t xml:space="preserve"> </w:t>
+      </w:r>
+      <w:r>
+        <w:rPr>
+          <w:rStyle w:val="VerbatimChar"/>
+        </w:rPr>
+        <w:t xml:space="preserve">chunkBody</w:t>
+      </w:r>
+      <w:r>
+        <w:t xml:space="preserve">,</w:t>
+      </w:r>
+      <w:r>
+        <w:t xml:space="preserve"> </w:t>
+      </w:r>
+      <w:r>
+        <w:rPr>
+          <w:rStyle w:val="VerbatimChar"/>
+        </w:rPr>
+        <w:t xml:space="preserve">scoreAboutness</w:t>
+      </w:r>
+      <w:r>
+        <w:t xml:space="preserve">,</w:t>
+      </w:r>
+      <w:r>
+        <w:t xml:space="preserve"> </w:t>
+      </w:r>
+      <w:r>
+        <w:rPr>
+          <w:rStyle w:val="VerbatimChar"/>
+        </w:rPr>
+        <w:t xml:space="preserve">applyCorpusHygiene</w:t>
+      </w:r>
+      <w:r>
+        <w:t xml:space="preserve">, SEC-heading regexes. The blocking is</w:t>
+      </w:r>
+      <w:r>
+        <w:t xml:space="preserve"> </w:t>
+      </w:r>
+      <w:r>
+        <w:rPr>
+          <w:bCs/>
+          <w:b/>
+        </w:rPr>
+        <w:t xml:space="preserve">distributed</w:t>
+      </w:r>
+      <w:r>
+        <w:t xml:space="preserve"> </w:t>
+      </w:r>
+      <w:r>
+        <w:t xml:space="preserve">(top-5 app functions ≈ 44 % of blocking; 312 distinct app functions), so no single hot-function fix unblocks the loop. The smallest boundary that reliably stops the pipeline blocking lock renewal is moving the</w:t>
+      </w:r>
+      <w:r>
+        <w:t xml:space="preserve"> </w:t>
+      </w:r>
+      <w:r>
+        <w:rPr>
+          <w:bCs/>
+          <w:b/>
+        </w:rPr>
+        <w:t xml:space="preserve">whole per-job pipeline</w:t>
+      </w:r>
+      <w:r>
+        <w:t xml:space="preserve"> </w:t>
+      </w:r>
+      <w:r>
+        <w:t xml:space="preserve">off the main loop (DESIGN.md). §7.1–§7.2 are recorded as a prioritised follow-up for a later, separately-reviewed scoring-performance change.</w:t>
+      </w:r>
+    </w:p>
+    <w:bookmarkEnd w:id="33"/>
+    <w:bookmarkEnd w:id="34"/>
+    <w:bookmarkEnd w:id="35"/>
     <w:sectPr/>
   </w:body>
 </w:document>

</xml_diff>

<commit_message>
docs(worker-isolation): full pool inventory, deadline/retry tables, parent-work audit, test results + log
</commit_message>
<xml_diff>
--- a/docs/worker-isolation/PROFILE_EVIDENCE.docx
+++ b/docs/worker-isolation/PROFILE_EVIDENCE.docx
@@ -2,7 +2,7 @@
 <file path=word/document.xml><?xml version="1.0" encoding="utf-8"?>
 <w:document xmlns:w="http://schemas.openxmlformats.org/wordprocessingml/2006/main" xmlns:m="http://schemas.openxmlformats.org/officeDocument/2006/math" xmlns:r="http://schemas.openxmlformats.org/officeDocument/2006/relationships" xmlns:o="urn:schemas-microsoft-com:office:office" xmlns:v="urn:schemas-microsoft-com:vml" xmlns:w10="urn:schemas-microsoft-com:office:word" xmlns:a="http://schemas.openxmlformats.org/drawingml/2006/main" xmlns:pic="http://schemas.openxmlformats.org/drawingml/2006/picture" xmlns:wp="http://schemas.openxmlformats.org/drawingml/2006/wordprocessingDrawing">
   <w:body>
-    <w:bookmarkStart w:id="35" w:name="Xb82fcf02904b4fb359837d5fc6a41fab8629057"/>
+    <w:bookmarkStart w:id="36" w:name="Xb82fcf02904b4fb359837d5fc6a41fab8629057"/>
     <w:p>
       <w:pPr>
         <w:pStyle w:val="Heading1"/>
@@ -6329,7 +6329,527 @@
     </w:p>
     <w:bookmarkEnd w:id="33"/>
     <w:bookmarkEnd w:id="34"/>
+    <w:bookmarkStart w:id="35" w:name="X83f1e8a7ae977f3fa8591d09c10c8b2a5fe1d0a"/>
+    <w:p>
+      <w:pPr>
+        <w:pStyle w:val="Heading2"/>
+      </w:pPr>
+      <w:r>
+        <w:t xml:space="preserve">8. Residual parent work under isolation (gap G)</w:t>
+      </w:r>
+    </w:p>
+    <w:p>
+      <w:pPr>
+        <w:pStyle w:val="FirstParagraph"/>
+      </w:pPr>
+      <w:r>
+        <w:t xml:space="preserve">Isolation moves</w:t>
+      </w:r>
+      <w:r>
+        <w:t xml:space="preserve"> </w:t>
+      </w:r>
+      <w:r>
+        <w:rPr>
+          <w:bCs/>
+          <w:b/>
+        </w:rPr>
+        <w:t xml:space="preserve">pipeline CPU</w:t>
+      </w:r>
+      <w:r>
+        <w:t xml:space="preserve"> </w:t>
+      </w:r>
+      <w:r>
+        <w:t xml:space="preserve">off the parent. It does not make the parent impossible to block. This section measures what the parent still does, on the same 2-vCPU sandbox, using</w:t>
+      </w:r>
+      <w:r>
+        <w:t xml:space="preserve"> </w:t>
+      </w:r>
+      <w:r>
+        <w:rPr>
+          <w:rStyle w:val="VerbatimChar"/>
+        </w:rPr>
+        <w:t xml:space="preserve">server/lib/job-isolation.test.ts</w:t>
+      </w:r>
+      <w:r>
+        <w:t xml:space="preserve">. Instrumentation comes from</w:t>
+      </w:r>
+      <w:r>
+        <w:t xml:space="preserve"> </w:t>
+      </w:r>
+      <w:r>
+        <w:rPr>
+          <w:rStyle w:val="VerbatimChar"/>
+        </w:rPr>
+        <w:t xml:space="preserve">job-isolation.ts</w:t>
+      </w:r>
+      <w:r>
+        <w:t xml:space="preserve"> </w:t>
+      </w:r>
+      <w:r>
+        <w:rPr>
+          <w:rStyle w:val="VerbatimChar"/>
+        </w:rPr>
+        <w:t xml:space="preserve">__testing.stats()</w:t>
+      </w:r>
+      <w:r>
+        <w:t xml:space="preserve">, and lag is measured with a 10 ms</w:t>
+      </w:r>
+      <w:r>
+        <w:t xml:space="preserve"> </w:t>
+      </w:r>
+      <w:r>
+        <w:rPr>
+          <w:rStyle w:val="VerbatimChar"/>
+        </w:rPr>
+        <w:t xml:space="preserve">setInterval</w:t>
+      </w:r>
+      <w:r>
+        <w:t xml:space="preserve"> </w:t>
+      </w:r>
+      <w:r>
+        <w:t xml:space="preserve">probe on the parent.</w:t>
+      </w:r>
+    </w:p>
+    <w:tbl>
+      <w:tblPr>
+        <w:tblStyle w:val="Table"/>
+        <w:tblW w:type="pct" w:w="5000"/>
+        <w:tblLook w:firstRow="1" w:lastRow="0" w:firstColumn="0" w:lastColumn="0" w:noHBand="0" w:noVBand="0" w:val="0020"/>
+        <w:jc w:val="start"/>
+      </w:tblPr>
+      <w:tblGrid>
+        <w:gridCol w:w="2640"/>
+        <w:gridCol w:w="2640"/>
+        <w:gridCol w:w="2640"/>
+      </w:tblGrid>
+      <w:tr>
+        <w:trPr>
+          <w:tblHeader w:val="true"/>
+        </w:trPr>
+        <w:tc>
+          <w:tcPr/>
+          <w:p>
+            <w:pPr>
+              <w:pStyle w:val="Compact"/>
+              <w:jc w:val="left"/>
+            </w:pPr>
+            <w:r>
+              <w:t xml:space="preserve">Scenario</w:t>
+            </w:r>
+          </w:p>
+        </w:tc>
+        <w:tc>
+          <w:tcPr/>
+          <w:p>
+            <w:pPr>
+              <w:pStyle w:val="Compact"/>
+              <w:jc w:val="left"/>
+            </w:pPr>
+            <w:r>
+              <w:t xml:space="preserve">Parent max event-loop lag</w:t>
+            </w:r>
+          </w:p>
+        </w:tc>
+        <w:tc>
+          <w:tcPr/>
+          <w:p>
+            <w:pPr>
+              <w:pStyle w:val="Compact"/>
+              <w:jc w:val="left"/>
+            </w:pPr>
+            <w:r>
+              <w:t xml:space="preserve">Other parent costs</w:t>
+            </w:r>
+          </w:p>
+        </w:tc>
+      </w:tr>
+      <w:tr>
+        <w:tc>
+          <w:tcPr/>
+          <w:p>
+            <w:pPr>
+              <w:pStyle w:val="Compact"/>
+              <w:jc w:val="left"/>
+            </w:pPr>
+            <w:r>
+              <w:t xml:space="preserve">1 child busy-looping 3 s (test 1)</w:t>
+            </w:r>
+          </w:p>
+        </w:tc>
+        <w:tc>
+          <w:tcPr/>
+          <w:p>
+            <w:pPr>
+              <w:pStyle w:val="Compact"/>
+              <w:jc w:val="left"/>
+            </w:pPr>
+            <w:r>
+              <w:t xml:space="preserve">3.0 ms (earlier runs 1.6 / 3.8 ms)</w:t>
+            </w:r>
+          </w:p>
+        </w:tc>
+        <w:tc>
+          <w:tcPr/>
+          <w:p>
+            <w:pPr>
+              <w:pStyle w:val="Compact"/>
+              <w:jc w:val="left"/>
+            </w:pPr>
+            <w:r>
+              <w:t xml:space="preserve">n/a</w:t>
+            </w:r>
+          </w:p>
+        </w:tc>
+      </w:tr>
+      <w:tr>
+        <w:tc>
+          <w:tcPr/>
+          <w:p>
+            <w:pPr>
+              <w:pStyle w:val="Compact"/>
+              <w:jc w:val="left"/>
+            </w:pPr>
+            <w:r>
+              <w:rPr>
+                <w:bCs/>
+                <w:b/>
+              </w:rPr>
+              <w:t xml:space="preserve">4 CPU-bound children on 2 CPUs</w:t>
+            </w:r>
+            <w:r>
+              <w:t xml:space="preserve"> </w:t>
+            </w:r>
+            <w:r>
+              <w:t xml:space="preserve">(G1)</w:t>
+            </w:r>
+          </w:p>
+        </w:tc>
+        <w:tc>
+          <w:tcPr/>
+          <w:p>
+            <w:pPr>
+              <w:pStyle w:val="Compact"/>
+              <w:jc w:val="left"/>
+            </w:pPr>
+            <w:r>
+              <w:rPr>
+                <w:bCs/>
+                <w:b/>
+              </w:rPr>
+              <w:t xml:space="preserve">10.4 ms</w:t>
+            </w:r>
+            <w:r>
+              <w:t xml:space="preserve"> </w:t>
+            </w:r>
+            <w:r>
+              <w:t xml:space="preserve">(earlier runs 4.5 / 4.6 ms)</w:t>
+            </w:r>
+          </w:p>
+        </w:tc>
+        <w:tc>
+          <w:tcPr/>
+          <w:p>
+            <w:pPr>
+              <w:pStyle w:val="Compact"/>
+              <w:jc w:val="left"/>
+            </w:pPr>
+            <w:r>
+              <w:t xml:space="preserve">forks 4, max</w:t>
+            </w:r>
+            <w:r>
+              <w:t xml:space="preserve"> </w:t>
+            </w:r>
+            <w:r>
+              <w:rPr>
+                <w:rStyle w:val="VerbatimChar"/>
+              </w:rPr>
+              <w:t xml:space="preserve">fork()</w:t>
+            </w:r>
+            <w:r>
+              <w:t xml:space="preserve"> </w:t>
+            </w:r>
+            <w:r>
+              <w:t xml:space="preserve">7.6 ms (earlier 2.6 / 9.1), 12 IPC messages, max handler 0.10 ms</w:t>
+            </w:r>
+          </w:p>
+        </w:tc>
+      </w:tr>
+      <w:tr>
+        <w:tc>
+          <w:tcPr/>
+          <w:p>
+            <w:pPr>
+              <w:pStyle w:val="Compact"/>
+              <w:jc w:val="left"/>
+            </w:pPr>
+            <w:r>
+              <w:t xml:space="preserve">Real 36-measure pipeline in child, stub PG/providers (test 7)</w:t>
+            </w:r>
+          </w:p>
+        </w:tc>
+        <w:tc>
+          <w:tcPr/>
+          <w:p>
+            <w:pPr>
+              <w:pStyle w:val="Compact"/>
+              <w:jc w:val="left"/>
+            </w:pPr>
+            <w:r>
+              <w:t xml:space="preserve">67.2 ms in the final run (earlier 7.7 / 10.2 / 12.2 / 16.9 / 39.4 ms)</w:t>
+            </w:r>
+          </w:p>
+        </w:tc>
+        <w:tc>
+          <w:tcPr/>
+          <w:p>
+            <w:pPr>
+              <w:pStyle w:val="Compact"/>
+              <w:jc w:val="left"/>
+            </w:pPr>
+            <w:r>
+              <w:t xml:space="preserve">168 provider calls brokered over IPC</w:t>
+            </w:r>
+          </w:p>
+        </w:tc>
+      </w:tr>
+    </w:tbl>
+    <w:p>
+      <w:pPr>
+        <w:pStyle w:val="BodyText"/>
+      </w:pPr>
+      <w:r>
+        <w:t xml:space="preserve">For comparison, the in-process baseline (§2) showed ELD max</w:t>
+      </w:r>
+      <w:r>
+        <w:t xml:space="preserve"> </w:t>
+      </w:r>
+      <w:r>
+        <w:rPr>
+          <w:bCs/>
+          <w:b/>
+        </w:rPr>
+        <w:t xml:space="preserve">8,254 ms</w:t>
+      </w:r>
+      <w:r>
+        <w:t xml:space="preserve"> </w:t>
+      </w:r>
+      <w:r>
+        <w:t xml:space="preserve">at c4.</w:t>
+      </w:r>
+    </w:p>
+    <w:p>
+      <w:pPr>
+        <w:pStyle w:val="BodyText"/>
+      </w:pPr>
+      <w:r>
+        <w:t xml:space="preserve">The test-7 figure varies run to run under host load. Every value is below the 100 ms threshold. Likely contributors to the higher test-7 values, not isolated by measurement: the parent’s usage flush retrying against the stub PG (it logs</w:t>
+      </w:r>
+      <w:r>
+        <w:t xml:space="preserve"> </w:t>
+      </w:r>
+      <w:r>
+        <w:rPr>
+          <w:rStyle w:val="VerbatimChar"/>
+        </w:rPr>
+        <w:t xml:space="preserve">ECONNREFUSED</w:t>
+      </w:r>
+      <w:r>
+        <w:t xml:space="preserve">), and host contention from the child’s CPU.</w:t>
+      </w:r>
+    </w:p>
+    <w:p>
+      <w:pPr>
+        <w:pStyle w:val="BodyText"/>
+      </w:pPr>
+      <w:r>
+        <w:rPr>
+          <w:bCs/>
+          <w:b/>
+        </w:rPr>
+        <w:t xml:space="preserve">What can still block the parent:</w:t>
+      </w:r>
+      <w:r>
+        <w:t xml:space="preserve"> </w:t>
+      </w:r>
+      <w:r>
+        <w:t xml:space="preserve">-</w:t>
+      </w:r>
+      <w:r>
+        <w:t xml:space="preserve"> </w:t>
+      </w:r>
+      <w:r>
+        <w:rPr>
+          <w:bCs/>
+          <w:b/>
+        </w:rPr>
+        <w:t xml:space="preserve">Host CPU saturation.</w:t>
+      </w:r>
+      <w:r>
+        <w:t xml:space="preserve"> </w:t>
+      </w:r>
+      <w:r>
+        <w:t xml:space="preserve">4 CPU-bound children compete with the parent on 2 vCPU. Children run at nice 10, and their Chromium and pdftotext descendants inherit it. This mitigates the contention but does not eliminate it.</w:t>
+      </w:r>
+      <w:r>
+        <w:t xml:space="preserve"> </w:t>
+      </w:r>
+      <w:r>
+        <w:t xml:space="preserve">-</w:t>
+      </w:r>
+      <w:r>
+        <w:t xml:space="preserve"> </w:t>
+      </w:r>
+      <w:r>
+        <w:rPr>
+          <w:bCs/>
+          <w:b/>
+        </w:rPr>
+        <w:t xml:space="preserve">Synchronous</w:t>
+      </w:r>
+      <w:r>
+        <w:rPr>
+          <w:bCs/>
+          <w:b/>
+        </w:rPr>
+        <w:t xml:space="preserve"> </w:t>
+      </w:r>
+      <w:r>
+        <w:rPr>
+          <w:rStyle w:val="VerbatimChar"/>
+          <w:bCs/>
+          <w:b/>
+        </w:rPr>
+        <w:t xml:space="preserve">fork()</w:t>
+      </w:r>
+      <w:r>
+        <w:rPr>
+          <w:bCs/>
+          <w:b/>
+        </w:rPr>
+        <w:t xml:space="preserve">.</w:t>
+      </w:r>
+      <w:r>
+        <w:t xml:space="preserve"> </w:t>
+      </w:r>
+      <w:r>
+        <w:t xml:space="preserve">Bounded, at single-digit milliseconds.</w:t>
+      </w:r>
+      <w:r>
+        <w:t xml:space="preserve"> </w:t>
+      </w:r>
+      <w:r>
+        <w:t xml:space="preserve">-</w:t>
+      </w:r>
+      <w:r>
+        <w:t xml:space="preserve"> </w:t>
+      </w:r>
+      <w:r>
+        <w:rPr>
+          <w:bCs/>
+          <w:b/>
+        </w:rPr>
+        <w:t xml:space="preserve">Structured clone of the</w:t>
+      </w:r>
+      <w:r>
+        <w:rPr>
+          <w:bCs/>
+          <w:b/>
+        </w:rPr>
+        <w:t xml:space="preserve"> </w:t>
+      </w:r>
+      <w:r>
+        <w:rPr>
+          <w:rStyle w:val="VerbatimChar"/>
+          <w:bCs/>
+          <w:b/>
+        </w:rPr>
+        <w:t xml:space="preserve">init</w:t>
+      </w:r>
+      <w:r>
+        <w:rPr>
+          <w:bCs/>
+          <w:b/>
+        </w:rPr>
+        <w:t xml:space="preserve"> </w:t>
+      </w:r>
+      <w:r>
+        <w:rPr>
+          <w:bCs/>
+          <w:b/>
+        </w:rPr>
+        <w:t xml:space="preserve">payload and the result.</w:t>
+      </w:r>
+      <w:r>
+        <w:t xml:space="preserve"> </w:t>
+      </w:r>
+      <w:r>
+        <w:t xml:space="preserve">Proportional to the company, framework, measures and BatchFetchState sizes. It is small for the corpus tested. Very large payloads were not measured.</w:t>
+      </w:r>
+      <w:r>
+        <w:t xml:space="preserve"> </w:t>
+      </w:r>
+      <w:r>
+        <w:t xml:space="preserve">-</w:t>
+      </w:r>
+      <w:r>
+        <w:t xml:space="preserve"> </w:t>
+      </w:r>
+      <w:r>
+        <w:rPr>
+          <w:bCs/>
+          <w:b/>
+        </w:rPr>
+        <w:t xml:space="preserve">GC of the parent heap.</w:t>
+      </w:r>
+      <w:r>
+        <w:t xml:space="preserve"> </w:t>
+      </w:r>
+      <w:r>
+        <w:t xml:space="preserve">The parent holds no pipeline objects, so its heap is small.</w:t>
+      </w:r>
+      <w:r>
+        <w:t xml:space="preserve"> </w:t>
+      </w:r>
+      <w:r>
+        <w:t xml:space="preserve">-</w:t>
+      </w:r>
+      <w:r>
+        <w:t xml:space="preserve"> </w:t>
+      </w:r>
+      <w:r>
+        <w:rPr>
+          <w:bCs/>
+          <w:b/>
+        </w:rPr>
+        <w:t xml:space="preserve">Unchanged supervisor work.</w:t>
+      </w:r>
+      <w:r>
+        <w:t xml:space="preserve"> </w:t>
+      </w:r>
+      <w:r>
+        <w:t xml:space="preserve">Lock renewal, heartbeat, ownership watch, cancel poll, permit broker, usage flush and terminal writes are I/O-bound or O(1).</w:t>
+      </w:r>
+    </w:p>
+    <w:p>
+      <w:pPr>
+        <w:pStyle w:val="BodyText"/>
+      </w:pPr>
+      <w:r>
+        <w:rPr>
+          <w:bCs/>
+          <w:b/>
+        </w:rPr>
+        <w:t xml:space="preserve">Not measured:</w:t>
+      </w:r>
+      <w:r>
+        <w:t xml:space="preserve"> </w:t>
+      </w:r>
+      <w:r>
+        <w:t xml:space="preserve">production CPUs, production corpus sizes (§5), real Postgres/Redis latency, and real Chromium launches in children.</w:t>
+      </w:r>
+    </w:p>
     <w:bookmarkEnd w:id="35"/>
+    <w:bookmarkEnd w:id="36"/>
     <w:sectPr/>
   </w:body>
 </w:document>

</xml_diff>